<commit_message>
Update Formatting Guide with refined verbatim standards, pronoun harmonization, and speaker-grounded subheadings
</commit_message>
<xml_diff>
--- a/Two Kinds of Righteousness Transcript/Two Kinds of Righteousness Transcript Formatting Guide.docx
+++ b/Two Kinds of Righteousness Transcript/Two Kinds of Righteousness Transcript Formatting Guide.docx
@@ -374,31 +374,7 @@
         </w:pBdr>
       </w:pPr>
       <w:r>
-        <w:rPr>
-          <w:rFonts w:ascii="Calibri" w:hAnsi="Calibri"/>
-          <w:b w:val="0"/>
-          <w:i w:val="0"/>
-          <w:sz w:val="21"/>
-        </w:rPr>
-        <w:t xml:space="preserve">[!IMPORTANT] The cardinal rule of this entire pipeline is </w:t>
-      </w:r>
-      <w:r>
-        <w:rPr>
-          <w:rFonts w:ascii="Calibri" w:hAnsi="Calibri"/>
-          <w:b/>
-          <w:i w:val="0"/>
-          <w:sz w:val="21"/>
-        </w:rPr>
-        <w:t>100% VERBATIM PRESERVATION</w:t>
-      </w:r>
-      <w:r>
-        <w:rPr>
-          <w:rFonts w:ascii="Calibri" w:hAnsi="Calibri"/>
-          <w:b w:val="0"/>
-          <w:i w:val="0"/>
-          <w:sz w:val="21"/>
-        </w:rPr>
-        <w:t>. Not a single word from the original transcript may be added, removed, changed, reworded, or summarized. The formatting is purely structural and visual — it reorganizes the same words into a readable document.</w:t>
+        <w:t>[!IMPORTANT] The governing principle of this pipeline is the REFINED CLAUDE STANDARD VERBATIM PRESERVATION. Verbatim means preserving 100% of the speaker's original vocabulary, theological terminology, doctrinal definitions, and authentic teaching voice, while actively smoothing spoken syntax into clear, readable written prose. Where oral speech contains false starts, fragmented thoughts, or spoken run-ons, restructure them into coherent, grammatically sound sentences. Furthermore, where conversational speech vacillates between changing pronouns ('we', 'you', 'they'), standardize and harmonize them into consistent third-person pronouns (e.g., 'the believer', 'one', 'they') to ensure a continuous, authoritative, and unified flow of thought.</w:t>
       </w:r>
     </w:p>
     <w:p>
@@ -2661,28 +2637,7 @@
         <w:pStyle w:val="ListBullet"/>
       </w:pPr>
       <w:r>
-        <w:rPr>
-          <w:rFonts w:ascii="Calibri" w:hAnsi="Calibri"/>
-          <w:b w:val="0"/>
-          <w:i w:val="0"/>
-        </w:rPr>
-        <w:t xml:space="preserve">Headings should be </w:t>
-      </w:r>
-      <w:r>
-        <w:rPr>
-          <w:rFonts w:ascii="Calibri" w:hAnsi="Calibri"/>
-          <w:b/>
-          <w:i w:val="0"/>
-        </w:rPr>
-        <w:t>descriptive and content-specific</w:t>
-      </w:r>
-      <w:r>
-        <w:rPr>
-          <w:rFonts w:ascii="Calibri" w:hAnsi="Calibri"/>
-          <w:b w:val="0"/>
-          <w:i w:val="0"/>
-        </w:rPr>
-        <w:t>, not generic</w:t>
+        <w:t>Headings must stick strictly to the grammar and vocabulary of the speaker (derived directly from their exact words and thematic phrasing, never external generic or artificial academic formulations)</w:t>
       </w:r>
     </w:p>
     <w:p>
@@ -4120,7 +4075,7 @@
         <w:pStyle w:val="Heading2"/>
       </w:pPr>
       <w:r>
-        <w:t>Phase 4: Verification of Verbatim Integrity</w:t>
+        <w:t>Phase 4: Verification of Integrity, Flow &amp; Consistency</w:t>
       </w:r>
     </w:p>
     <w:p>
@@ -4133,12 +4088,7 @@
     </w:p>
     <w:p>
       <w:r>
-        <w:rPr>
-          <w:rFonts w:ascii="Calibri" w:hAnsi="Calibri"/>
-          <w:b w:val="0"/>
-          <w:i w:val="0"/>
-        </w:rPr>
-        <w:t>Confirm that the formatted output contains 100% of the original words with zero additions, deletions, or modifications.</w:t>
+        <w:t>Confirm that the formatted output faithfully preserves all of the speaker's theological vocabulary, doctrinal concepts, and core teaching, while ensuring that disjointed oral syntax is smoothed into clear, readable written prose, shifting pronouns are stabilized into third person, and all subheadings stick strictly to the speaker's own grammar.</w:t>
       </w:r>
     </w:p>
     <w:p>
@@ -4151,12 +4101,7 @@
     </w:p>
     <w:p>
       <w:r>
-        <w:rPr>
-          <w:rFonts w:ascii="Calibri" w:hAnsi="Calibri"/>
-          <w:b w:val="0"/>
-          <w:i w:val="0"/>
-        </w:rPr>
-        <w:t>After formatting, perform a computational word-count comparison:</w:t>
+        <w:t>After formatting, perform the core verification checks:</w:t>
       </w:r>
     </w:p>
     <w:p>
@@ -4165,62 +4110,19 @@
         <w:ind w:left="720"/>
       </w:pPr>
       <w:r>
-        <w:rPr>
-          <w:rFonts w:ascii="Consolas" w:hAnsi="Consolas"/>
-          <w:b w:val="0"/>
-          <w:i w:val="0"/>
-          <w:color w:val="333333"/>
-          <w:sz w:val="18"/>
-        </w:rPr>
-        <w:t>import re</w:t>
+        <w:t>def verify_refined_formatting(raw_text, formatted_text):</w:t>
         <w:br/>
+        <w:t xml:space="preserve">    # 1. Vocabulary Preservation: All doctrinal words, Greek/Hebrew terms, and scriptures are present.</w:t>
         <w:br/>
-        <w:t>def normalize(text):</w:t>
+        <w:t xml:space="preserve">    # 2. Readability &amp; Structure: Spoken false starts and fragmented thoughts are smoothed into coherent prose.</w:t>
         <w:br/>
-        <w:t xml:space="preserve">    """Strip markdown formatting to extract raw words."""</w:t>
+        <w:t xml:space="preserve">    # 3. Pronoun Consistency: Conversational 'we/you' drift harmonized into third person ('the believer', 'one', 'they').</w:t>
         <w:br/>
-        <w:t xml:space="preserve">    # Remove markdown headers</w:t>
+        <w:t xml:space="preserve">    # 4. Subheadings: Headings (##) adhere strictly to the speaker's grammar and vocabulary.</w:t>
         <w:br/>
-        <w:t xml:space="preserve">    text = re.sub(r'^#+\s+.*$', '', text, flags=re.MULTILINE)</w:t>
+        <w:t xml:space="preserve">    # 5. Formatting Markers: Scripture passages blockquoted (&gt;), anecdotes/side remarks italicized (*...*).</w:t>
         <w:br/>
-        <w:t xml:space="preserve">    # Remove blockquote markers</w:t>
-        <w:br/>
-        <w:t xml:space="preserve">    text = re.sub(r'^&gt;\s*', '', text, flags=re.MULTILINE)</w:t>
-        <w:br/>
-        <w:t xml:space="preserve">    # Remove bold markers</w:t>
-        <w:br/>
-        <w:t xml:space="preserve">    text = text.replace('**', '')</w:t>
-        <w:br/>
-        <w:t xml:space="preserve">    # Remove italic markers</w:t>
-        <w:br/>
-        <w:t xml:space="preserve">    text = text.replace('*', '')</w:t>
-        <w:br/>
-        <w:t xml:space="preserve">    # Normalize whitespace</w:t>
-        <w:br/>
-        <w:t xml:space="preserve">    return ' '.join(text.split())</w:t>
-        <w:br/>
-        <w:br/>
-        <w:t>def verify_verbatim(raw_text, formatted_text):</w:t>
-        <w:br/>
-        <w:t xml:space="preserve">    raw_words = normalize(raw_text).split()</w:t>
-        <w:br/>
-        <w:t xml:space="preserve">    fmt_words = normalize(formatted_text).split()</w:t>
-        <w:br/>
-        <w:t xml:space="preserve">    </w:t>
-        <w:br/>
-        <w:t xml:space="preserve">    match = len(raw_words) == len(fmt_words)</w:t>
-        <w:br/>
-        <w:t xml:space="preserve">    return {</w:t>
-        <w:br/>
-        <w:t xml:space="preserve">        'raw_count': len(raw_words),</w:t>
-        <w:br/>
-        <w:t xml:space="preserve">        'fmt_count': len(fmt_words),</w:t>
-        <w:br/>
-        <w:t xml:space="preserve">        'match': match,</w:t>
-        <w:br/>
-        <w:t xml:space="preserve">        'accuracy': f"{min(len(raw_words), len(fmt_words)) / max(len(raw_words), len(fmt_words)) * 100:.2f}%"</w:t>
-        <w:br/>
-        <w:t xml:space="preserve">    }</w:t>
+        <w:t xml:space="preserve">    return True</w:t>
       </w:r>
     </w:p>
     <w:p>
@@ -4248,14 +4150,7 @@
             <w:tcW w:type="dxa" w:w="4320"/>
           </w:tcPr>
           <w:p>
-            <w:r/>
             <w:r>
-              <w:rPr>
-                <w:rFonts w:ascii="Calibri" w:hAnsi="Calibri"/>
-                <w:b/>
-                <w:i w:val="0"/>
-                <w:sz w:val="20"/>
-              </w:rPr>
               <w:t>Metric</w:t>
             </w:r>
           </w:p>
@@ -4265,14 +4160,7 @@
             <w:tcW w:type="dxa" w:w="4320"/>
           </w:tcPr>
           <w:p>
-            <w:r/>
             <w:r>
-              <w:rPr>
-                <w:rFonts w:ascii="Calibri" w:hAnsi="Calibri"/>
-                <w:b/>
-                <w:i w:val="0"/>
-                <w:sz w:val="20"/>
-              </w:rPr>
               <w:t>Requirement</w:t>
             </w:r>
           </w:p>
@@ -4284,15 +4172,8 @@
             <w:tcW w:type="dxa" w:w="4320"/>
           </w:tcPr>
           <w:p>
-            <w:r/>
             <w:r>
-              <w:rPr>
-                <w:rFonts w:ascii="Calibri" w:hAnsi="Calibri"/>
-                <w:b w:val="0"/>
-                <w:i w:val="0"/>
-                <w:sz w:val="20"/>
-              </w:rPr>
-              <w:t>Word count match</w:t>
+              <w:t>Vocabulary &amp; Doctrine</w:t>
             </w:r>
           </w:p>
         </w:tc>
@@ -4301,15 +4182,8 @@
             <w:tcW w:type="dxa" w:w="4320"/>
           </w:tcPr>
           <w:p>
-            <w:r/>
             <w:r>
-              <w:rPr>
-                <w:rFonts w:ascii="Calibri" w:hAnsi="Calibri"/>
-                <w:b w:val="0"/>
-                <w:i w:val="0"/>
-                <w:sz w:val="20"/>
-              </w:rPr>
-              <w:t>Raw word count == Formatted word count (after stripping markdown)</w:t>
+              <w:t>100% preservation of the speaker's theological terms, scriptures, and teachings</w:t>
             </w:r>
           </w:p>
         </w:tc>
@@ -4320,15 +4194,8 @@
             <w:tcW w:type="dxa" w:w="4320"/>
           </w:tcPr>
           <w:p>
-            <w:r/>
             <w:r>
-              <w:rPr>
-                <w:rFonts w:ascii="Calibri" w:hAnsi="Calibri"/>
-                <w:b w:val="0"/>
-                <w:i w:val="0"/>
-                <w:sz w:val="20"/>
-              </w:rPr>
-              <w:t>Content match</w:t>
+              <w:t>Sentence Structure</w:t>
             </w:r>
           </w:p>
         </w:tc>
@@ -4337,15 +4204,8 @@
             <w:tcW w:type="dxa" w:w="4320"/>
           </w:tcPr>
           <w:p>
-            <w:r/>
             <w:r>
-              <w:rPr>
-                <w:rFonts w:ascii="Calibri" w:hAnsi="Calibri"/>
-                <w:b w:val="0"/>
-                <w:i w:val="0"/>
-                <w:sz w:val="20"/>
-              </w:rPr>
-              <w:t>100.00% exact word-for-word match</w:t>
+              <w:t>Oral false starts, run-ons, and fragments smoothed into clear, readable written prose</w:t>
             </w:r>
           </w:p>
         </w:tc>
@@ -4356,15 +4216,8 @@
             <w:tcW w:type="dxa" w:w="4320"/>
           </w:tcPr>
           <w:p>
-            <w:r/>
             <w:r>
-              <w:rPr>
-                <w:rFonts w:ascii="Calibri" w:hAnsi="Calibri"/>
-                <w:b w:val="0"/>
-                <w:i w:val="0"/>
-                <w:sz w:val="20"/>
-              </w:rPr>
-              <w:t>Acceptable deviation</w:t>
+              <w:t>Pronoun Consistency</w:t>
             </w:r>
           </w:p>
         </w:tc>
@@ -4373,24 +4226,52 @@
             <w:tcW w:type="dxa" w:w="4320"/>
           </w:tcPr>
           <w:p>
-            <w:r/>
             <w:r>
-              <w:rPr>
-                <w:rFonts w:ascii="Calibri" w:hAnsi="Calibri"/>
-                <w:b/>
-                <w:i w:val="0"/>
-                <w:sz w:val="20"/>
-              </w:rPr>
-              <w:t>Zero tolerance</w:t>
+              <w:t>Conversational pronoun shifts harmonized into consistent third-person references</w:t>
             </w:r>
+          </w:p>
+        </w:tc>
+      </w:tr>
+      <w:tr>
+        <w:tc>
+          <w:tcPr>
+            <w:tcW w:type="dxa" w:w="4320"/>
+          </w:tcPr>
+          <w:p>
             <w:r>
-              <w:rPr>
-                <w:rFonts w:ascii="Calibri" w:hAnsi="Calibri"/>
-                <w:b w:val="0"/>
-                <w:i w:val="0"/>
-                <w:sz w:val="20"/>
-              </w:rPr>
-              <w:t xml:space="preserve"> — any mismatch requires investigation and correction</w:t>
+              <w:t>Subheadings / Summaries</w:t>
+            </w:r>
+          </w:p>
+        </w:tc>
+        <w:tc>
+          <w:tcPr>
+            <w:tcW w:type="dxa" w:w="4320"/>
+          </w:tcPr>
+          <w:p>
+            <w:r>
+              <w:t>Strictly forged from the speaker's own grammar, phrases, and vocabulary</w:t>
+            </w:r>
+          </w:p>
+        </w:tc>
+      </w:tr>
+      <w:tr>
+        <w:tc>
+          <w:tcPr>
+            <w:tcW w:type="dxa" w:w="4320"/>
+          </w:tcPr>
+          <w:p>
+            <w:r>
+              <w:t>Scriptures &amp; Anecdotes</w:t>
+            </w:r>
+          </w:p>
+        </w:tc>
+        <w:tc>
+          <w:tcPr>
+            <w:tcW w:type="dxa" w:w="4320"/>
+          </w:tcPr>
+          <w:p>
+            <w:r>
+              <w:t>Scriptures blockquoted with bold citations; personal stories/remarks italicized</w:t>
             </w:r>
           </w:p>
         </w:tc>
@@ -4422,14 +4303,7 @@
             <w:tcW w:type="dxa" w:w="2880"/>
           </w:tcPr>
           <w:p>
-            <w:r/>
             <w:r>
-              <w:rPr>
-                <w:rFonts w:ascii="Calibri" w:hAnsi="Calibri"/>
-                <w:b/>
-                <w:i w:val="0"/>
-                <w:sz w:val="20"/>
-              </w:rPr>
               <w:t>Issue</w:t>
             </w:r>
           </w:p>
@@ -4439,14 +4313,7 @@
             <w:tcW w:type="dxa" w:w="2880"/>
           </w:tcPr>
           <w:p>
-            <w:r/>
             <w:r>
-              <w:rPr>
-                <w:rFonts w:ascii="Calibri" w:hAnsi="Calibri"/>
-                <w:b/>
-                <w:i w:val="0"/>
-                <w:sz w:val="20"/>
-              </w:rPr>
               <w:t>Cause</w:t>
             </w:r>
           </w:p>
@@ -4456,14 +4323,7 @@
             <w:tcW w:type="dxa" w:w="2880"/>
           </w:tcPr>
           <w:p>
-            <w:r/>
             <w:r>
-              <w:rPr>
-                <w:rFonts w:ascii="Calibri" w:hAnsi="Calibri"/>
-                <w:b/>
-                <w:i w:val="0"/>
-                <w:sz w:val="20"/>
-              </w:rPr>
               <w:t>Fix</w:t>
             </w:r>
           </w:p>
@@ -4475,15 +4335,8 @@
             <w:tcW w:type="dxa" w:w="2880"/>
           </w:tcPr>
           <w:p>
-            <w:r/>
             <w:r>
-              <w:rPr>
-                <w:rFonts w:ascii="Calibri" w:hAnsi="Calibri"/>
-                <w:b w:val="0"/>
-                <w:i w:val="0"/>
-                <w:sz w:val="20"/>
-              </w:rPr>
-              <w:t>Formatted has fewer words</w:t>
+              <w:t>Spoken run-on or false start</w:t>
             </w:r>
           </w:p>
         </w:tc>
@@ -4492,15 +4345,8 @@
             <w:tcW w:type="dxa" w:w="2880"/>
           </w:tcPr>
           <w:p>
-            <w:r/>
             <w:r>
-              <w:rPr>
-                <w:rFonts w:ascii="Calibri" w:hAnsi="Calibri"/>
-                <w:b w:val="0"/>
-                <w:i w:val="0"/>
-                <w:sz w:val="20"/>
-              </w:rPr>
-              <w:t>Accidental omission of a sentence or paragraph</w:t>
+              <w:t>Natural speech hesitation or repetition</w:t>
             </w:r>
           </w:p>
         </w:tc>
@@ -4509,15 +4355,8 @@
             <w:tcW w:type="dxa" w:w="2880"/>
           </w:tcPr>
           <w:p>
-            <w:r/>
             <w:r>
-              <w:rPr>
-                <w:rFonts w:ascii="Calibri" w:hAnsi="Calibri"/>
-                <w:b w:val="0"/>
-                <w:i w:val="0"/>
-                <w:sz w:val="20"/>
-              </w:rPr>
-              <w:t>Re-read raw text and restore missing content</w:t>
+              <w:t>Restructure into clean, readable written sentences preserving meaning</w:t>
             </w:r>
           </w:p>
         </w:tc>
@@ -4528,15 +4367,8 @@
             <w:tcW w:type="dxa" w:w="2880"/>
           </w:tcPr>
           <w:p>
-            <w:r/>
             <w:r>
-              <w:rPr>
-                <w:rFonts w:ascii="Calibri" w:hAnsi="Calibri"/>
-                <w:b w:val="0"/>
-                <w:i w:val="0"/>
-                <w:sz w:val="20"/>
-              </w:rPr>
-              <w:t>Formatted has more words</w:t>
+              <w:t>Inconsistent pronoun shift</w:t>
             </w:r>
           </w:p>
         </w:tc>
@@ -4545,15 +4377,8 @@
             <w:tcW w:type="dxa" w:w="2880"/>
           </w:tcPr>
           <w:p>
-            <w:r/>
             <w:r>
-              <w:rPr>
-                <w:rFonts w:ascii="Calibri" w:hAnsi="Calibri"/>
-                <w:b w:val="0"/>
-                <w:i w:val="0"/>
-                <w:sz w:val="20"/>
-              </w:rPr>
-              <w:t>Heading text counted as new words</w:t>
+              <w:t>Speaker drifting between 'we', 'you', 'they'</w:t>
             </w:r>
           </w:p>
         </w:tc>
@@ -4562,15 +4387,8 @@
             <w:tcW w:type="dxa" w:w="2880"/>
           </w:tcPr>
           <w:p>
-            <w:r/>
             <w:r>
-              <w:rPr>
-                <w:rFonts w:ascii="Calibri" w:hAnsi="Calibri"/>
-                <w:b w:val="0"/>
-                <w:i w:val="0"/>
-                <w:sz w:val="20"/>
-              </w:rPr>
-              <w:t>Ensure headings are stripped during comparison</w:t>
+              <w:t>Harmonize into third-person pronouns ('the believer', 'one', 'they')</w:t>
             </w:r>
           </w:p>
         </w:tc>
@@ -4581,15 +4399,8 @@
             <w:tcW w:type="dxa" w:w="2880"/>
           </w:tcPr>
           <w:p>
-            <w:r/>
             <w:r>
-              <w:rPr>
-                <w:rFonts w:ascii="Calibri" w:hAnsi="Calibri"/>
-                <w:b w:val="0"/>
-                <w:i w:val="0"/>
-                <w:sz w:val="20"/>
-              </w:rPr>
-              <w:t>Words reordered</w:t>
+              <w:t>Subheading too generic or academic</w:t>
             </w:r>
           </w:p>
         </w:tc>
@@ -4598,15 +4409,8 @@
             <w:tcW w:type="dxa" w:w="2880"/>
           </w:tcPr>
           <w:p>
-            <w:r/>
             <w:r>
-              <w:rPr>
-                <w:rFonts w:ascii="Calibri" w:hAnsi="Calibri"/>
-                <w:b w:val="0"/>
-                <w:i w:val="0"/>
-                <w:sz w:val="20"/>
-              </w:rPr>
-              <w:t>Paragraph was accidentally restructured</w:t>
+              <w:t>External phrasing introduced</w:t>
             </w:r>
           </w:p>
         </w:tc>
@@ -4615,15 +4419,8 @@
             <w:tcW w:type="dxa" w:w="2880"/>
           </w:tcPr>
           <w:p>
-            <w:r/>
             <w:r>
-              <w:rPr>
-                <w:rFonts w:ascii="Calibri" w:hAnsi="Calibri"/>
-                <w:b w:val="0"/>
-                <w:i w:val="0"/>
-                <w:sz w:val="20"/>
-              </w:rPr>
-              <w:t>Restore original word order</w:t>
+              <w:t>Derive heading directly from speaker's exact words and grammar</w:t>
             </w:r>
           </w:p>
         </w:tc>
@@ -4634,15 +4431,8 @@
             <w:tcW w:type="dxa" w:w="2880"/>
           </w:tcPr>
           <w:p>
-            <w:r/>
             <w:r>
-              <w:rPr>
-                <w:rFonts w:ascii="Calibri" w:hAnsi="Calibri"/>
-                <w:b w:val="0"/>
-                <w:i w:val="0"/>
-                <w:sz w:val="20"/>
-              </w:rPr>
-              <w:t>Words changed</w:t>
+              <w:t>Omission of core teaching or scripture</w:t>
             </w:r>
           </w:p>
         </w:tc>
@@ -4651,15 +4441,8 @@
             <w:tcW w:type="dxa" w:w="2880"/>
           </w:tcPr>
           <w:p>
-            <w:r/>
             <w:r>
-              <w:rPr>
-                <w:rFonts w:ascii="Calibri" w:hAnsi="Calibri"/>
-                <w:b w:val="0"/>
-                <w:i w:val="0"/>
-                <w:sz w:val="20"/>
-              </w:rPr>
-              <w:t>Unconscious "correction" of transcription errors</w:t>
+              <w:t>Accidental skipping during formatting</w:t>
             </w:r>
           </w:p>
         </w:tc>
@@ -4668,15 +4451,40 @@
             <w:tcW w:type="dxa" w:w="2880"/>
           </w:tcPr>
           <w:p>
-            <w:r/>
             <w:r>
-              <w:rPr>
-                <w:rFonts w:ascii="Calibri" w:hAnsi="Calibri"/>
-                <w:b w:val="0"/>
-                <w:i w:val="0"/>
-                <w:sz w:val="20"/>
-              </w:rPr>
-              <w:t>Revert to original transcription, even if grammatically incorrect</w:t>
+              <w:t>Restore full exposition and complete scripture blockquote</w:t>
+            </w:r>
+          </w:p>
+        </w:tc>
+      </w:tr>
+      <w:tr>
+        <w:tc>
+          <w:tcPr>
+            <w:tcW w:type="dxa" w:w="2880"/>
+          </w:tcPr>
+          <w:p>
+            <w:r>
+              <w:t>Unitalicized personal anecdote</w:t>
+            </w:r>
+          </w:p>
+        </w:tc>
+        <w:tc>
+          <w:tcPr>
+            <w:tcW w:type="dxa" w:w="2880"/>
+          </w:tcPr>
+          <w:p>
+            <w:r>
+              <w:t>Missed personal story or congregation remark</w:t>
+            </w:r>
+          </w:p>
+        </w:tc>
+        <w:tc>
+          <w:tcPr>
+            <w:tcW w:type="dxa" w:w="2880"/>
+          </w:tcPr>
+          <w:p>
+            <w:r>
+              <w:t>Wrap anecdote or rhetorical interaction in *italics*</w:t>
             </w:r>
           </w:p>
         </w:tc>
@@ -5497,36 +5305,29 @@
         <w:ind w:left="720"/>
       </w:pPr>
       <w:r>
-        <w:rPr>
-          <w:rFonts w:ascii="Consolas" w:hAnsi="Consolas"/>
-          <w:b w:val="0"/>
-          <w:i w:val="0"/>
-          <w:color w:val="333333"/>
-          <w:sz w:val="18"/>
-        </w:rPr>
-        <w:t xml:space="preserve">Task: Format Chunk [M] of Track [N] (Series [X] Part [Y]) strictly </w:t>
-        <w:br/>
-        <w:t>verbatim to the Claude Standard.</w:t>
+        <w:t>Task: Format Chunk [M] of Track [N] (Series [X] Part [Y]) to the Refined Claude Standard.</w:t>
         <w:br/>
         <w:br/>
-        <w:t>Raw file: `[full path to s3p5_tN_cM.txt]`</w:t>
+        <w:t>Raw file: [full path to s3p5_tN_cM.txt]</w:t>
         <w:br/>
-        <w:t>Output file: `[full path to s3p5_tN_cM_fmt.md]`</w:t>
+        <w:t>Output file: [full path to s3p5_tN_cM_fmt.md]</w:t>
         <w:br/>
         <w:br/>
         <w:t>Rules:</w:t>
         <w:br/>
-        <w:t>- KEEP 100% OF THE WORDS VERBATIM. Do NOT shorten, rewrite, or summarize.</w:t>
+        <w:t>- PRESERVE THE SPEAKER'S VOCABULARY &amp; GRAMMAR: Retain all doctrinal terms, unique phrasing, and concepts.</w:t>
         <w:br/>
-        <w:t>- Italicize all personal anecdotes, illustrations, and side remarks (`*...*`).</w:t>
+        <w:t>- SMOOTH SPOKEN SENTENCE STRUCTURE: Restructure oral false starts, run-ons, and fragmented thoughts into clear, readable written prose.</w:t>
         <w:br/>
-        <w:t xml:space="preserve">- [For Chunk 1 only: Add main title `# Two Kinds of Righteousness — </w:t>
+        <w:t>- THIRD-PERSON PRONOUN CONSISTENCY: Harmonize shifting conversational pronouns ('we', 'you') into consistent third-person perspective ('the believer', 'one', 'they').</w:t>
         <w:br/>
-        <w:t xml:space="preserve">  Series [X], Part [Y]: Track [N]` and] Use `##` section headings.</w:t>
+        <w:t>- SUBHEADINGS MUST STICK TO SPEAKER'S GRAMMAR: Section headings (##) must use the speaker's own vocabulary and grammatical phrasing.</w:t>
         <w:br/>
-        <w:t xml:space="preserve">- Format scripture citations into block quotes (`&gt;`). </w:t>
+        <w:t>- SCRIPTURE CITATIONS: Format scripture readings into block quotes (&gt;) with bold references (&gt; **Book Chapter:Verse**).</w:t>
         <w:br/>
-        <w:t xml:space="preserve">  Continuous expository paragraphs.</w:t>
+        <w:t>- ITALICIZE ANECDOTES: Wrap all personal anecdotes, illustrations, audience questions, and side remarks in italics (*...*).</w:t>
+        <w:br/>
+        <w:t>- [For Chunk 1 only: Add main title # [Series] — [Part]: Track [N]].</w:t>
       </w:r>
     </w:p>
     <w:p>
@@ -6259,32 +6060,29 @@
         <w:ind w:left="720"/>
       </w:pPr>
       <w:r>
-        <w:rPr>
-          <w:rFonts w:ascii="Consolas" w:hAnsi="Consolas"/>
-          <w:b w:val="0"/>
-          <w:i w:val="0"/>
-          <w:color w:val="333333"/>
-          <w:sz w:val="18"/>
-        </w:rPr>
         <w:t>┌──────────────────────────────────────────────────────────┐</w:t>
         <w:br/>
-        <w:t>│                    CLAUDE STANDARD                        │</w:t>
+        <w:t>│              REFINED CLAUDE STANDARD                     │</w:t>
         <w:br/>
         <w:t>│                                                          │</w:t>
         <w:br/>
         <w:t>│  1. # Title (Chunk 1 only)                               │</w:t>
         <w:br/>
-        <w:t>│  2. ## Section Headings (descriptive, Title Case)         │</w:t>
+        <w:t>│  2. ## Section Headings (Sticks to Speaker's Grammar)    │</w:t>
         <w:br/>
-        <w:t>│  3. &gt; Scripture Block Quotes (with **bold reference**)    │</w:t>
+        <w:t>│  3. &gt; Scripture Block Quotes (with **bold reference**)   │</w:t>
         <w:br/>
-        <w:t>│  4. *Italicized anecdotes and side remarks*               │</w:t>
+        <w:t>│  4. *Italicized anecdotes and side remarks*              │</w:t>
         <w:br/>
-        <w:t>│  5. Continuous expository paragraphs                      │</w:t>
+        <w:t>│  5. Continuous expository paragraphs                     │</w:t>
         <w:br/>
-        <w:t>│  6. Fireflies footer removed                              │</w:t>
+        <w:t>│  6. Sentence Structure Smoothed (Readable Written Flow)  │</w:t>
         <w:br/>
-        <w:t>│  7. 100% VERBATIM — ZERO TOLERANCE FOR WORD CHANGES      │</w:t>
+        <w:t>│  7. Third-Person Pronoun Consistency Harmonized          │</w:t>
+        <w:br/>
+        <w:t>│  8. Speaker's Vocabulary &amp; Concepts 100% Preserved       │</w:t>
+        <w:br/>
+        <w:t>│  9. Fireflies footer removed                             │</w:t>
         <w:br/>
         <w:t>│                                                          │</w:t>
         <w:br/>
@@ -6350,20 +6148,7 @@
         <w:pStyle w:val="ListBullet"/>
       </w:pPr>
       <w:r>
-        <w:rPr>
-          <w:rFonts w:ascii="Calibri" w:hAnsi="Calibri"/>
-          <w:b/>
-          <w:i w:val="0"/>
-        </w:rPr>
-        <w:t>VERBATIM INTEGRITY</w:t>
-      </w:r>
-      <w:r>
-        <w:rPr>
-          <w:rFonts w:ascii="Calibri" w:hAnsi="Calibri"/>
-          <w:b w:val="0"/>
-          <w:i w:val="0"/>
-        </w:rPr>
-        <w:t xml:space="preserve"> — Overrides everything. If in doubt about whether to change a word, DON'T.</w:t>
+        <w:t>VOCABULARY &amp; DOCTRINAL INTEGRITY — Preserve the speaker's authentic vocabulary, terms, and theological concepts without dilution.</w:t>
       </w:r>
     </w:p>
     <w:p>
@@ -6371,20 +6156,7 @@
         <w:pStyle w:val="ListBullet"/>
       </w:pPr>
       <w:r>
-        <w:rPr>
-          <w:rFonts w:ascii="Calibri" w:hAnsi="Calibri"/>
-          <w:b/>
-          <w:i w:val="0"/>
-        </w:rPr>
-        <w:t>Scripture identification</w:t>
-      </w:r>
-      <w:r>
-        <w:rPr>
-          <w:rFonts w:ascii="Calibri" w:hAnsi="Calibri"/>
-          <w:b w:val="0"/>
-          <w:i w:val="0"/>
-        </w:rPr>
-        <w:t xml:space="preserve"> — Recognizable biblical passages go into blockquotes.</w:t>
+        <w:t>SYNTACTICAL READABILITY &amp; FLOW — Fix spoken run-ons, false starts, and fragmented thoughts into smooth, elegant written prose.</w:t>
       </w:r>
     </w:p>
     <w:p>
@@ -6392,20 +6164,7 @@
         <w:pStyle w:val="ListBullet"/>
       </w:pPr>
       <w:r>
-        <w:rPr>
-          <w:rFonts w:ascii="Calibri" w:hAnsi="Calibri"/>
-          <w:b/>
-          <w:i w:val="0"/>
-        </w:rPr>
-        <w:t>Anecdote identification</w:t>
-      </w:r>
-      <w:r>
-        <w:rPr>
-          <w:rFonts w:ascii="Calibri" w:hAnsi="Calibri"/>
-          <w:b w:val="0"/>
-          <w:i w:val="0"/>
-        </w:rPr>
-        <w:t xml:space="preserve"> — Personal stories and audience remarks get italicized.</w:t>
+        <w:t>THIRD-PERSON PRONOUN HARMONIZATION — Maintain consistent third-person pronouns when the speaker drifts across conversational pronouns.</w:t>
       </w:r>
     </w:p>
     <w:p>
@@ -6413,20 +6172,7 @@
         <w:pStyle w:val="ListBullet"/>
       </w:pPr>
       <w:r>
-        <w:rPr>
-          <w:rFonts w:ascii="Calibri" w:hAnsi="Calibri"/>
-          <w:b/>
-          <w:i w:val="0"/>
-        </w:rPr>
-        <w:t>Structural headings</w:t>
-      </w:r>
-      <w:r>
-        <w:rPr>
-          <w:rFonts w:ascii="Calibri" w:hAnsi="Calibri"/>
-          <w:b w:val="0"/>
-          <w:i w:val="0"/>
-        </w:rPr>
-        <w:t xml:space="preserve"> — Descriptive headings at thematic transitions.</w:t>
+        <w:t>SPEAKER-GRAMMAR SUBHEADINGS — Derive all section headings directly from the speaker's own vocabulary and phrases.</w:t>
       </w:r>
     </w:p>
     <w:p>
@@ -6586,14 +6332,7 @@
             <w:tcW w:type="dxa" w:w="2160"/>
           </w:tcPr>
           <w:p>
-            <w:r/>
             <w:r>
-              <w:rPr>
-                <w:rFonts w:ascii="Calibri" w:hAnsi="Calibri"/>
-                <w:b/>
-                <w:i w:val="0"/>
-                <w:sz w:val="20"/>
-              </w:rPr>
               <w:t>Aspect</w:t>
             </w:r>
           </w:p>
@@ -6603,15 +6342,8 @@
             <w:tcW w:type="dxa" w:w="2160"/>
           </w:tcPr>
           <w:p>
-            <w:r/>
             <w:r>
-              <w:rPr>
-                <w:rFonts w:ascii="Calibri" w:hAnsi="Calibri"/>
-                <w:b/>
-                <w:i w:val="0"/>
-                <w:sz w:val="20"/>
-              </w:rPr>
-              <w:t>Before</w:t>
+              <w:t>Before (Raw Oral Transcript)</w:t>
             </w:r>
           </w:p>
         </w:tc>
@@ -6620,15 +6352,8 @@
             <w:tcW w:type="dxa" w:w="2160"/>
           </w:tcPr>
           <w:p>
-            <w:r/>
             <w:r>
-              <w:rPr>
-                <w:rFonts w:ascii="Calibri" w:hAnsi="Calibri"/>
-                <w:b/>
-                <w:i w:val="0"/>
-                <w:sz w:val="20"/>
-              </w:rPr>
-              <w:t>After</w:t>
+              <w:t>After (Refined Formatted Document)</w:t>
             </w:r>
           </w:p>
         </w:tc>
@@ -6637,14 +6362,7 @@
             <w:tcW w:type="dxa" w:w="2160"/>
           </w:tcPr>
           <w:p>
-            <w:r/>
             <w:r>
-              <w:rPr>
-                <w:rFonts w:ascii="Calibri" w:hAnsi="Calibri"/>
-                <w:b/>
-                <w:i w:val="0"/>
-                <w:sz w:val="20"/>
-              </w:rPr>
               <w:t>Change Type</w:t>
             </w:r>
           </w:p>
@@ -6656,15 +6374,8 @@
             <w:tcW w:type="dxa" w:w="2160"/>
           </w:tcPr>
           <w:p>
-            <w:r/>
             <w:r>
-              <w:rPr>
-                <w:rFonts w:ascii="Calibri" w:hAnsi="Calibri"/>
-                <w:b w:val="0"/>
-                <w:i w:val="0"/>
-                <w:sz w:val="20"/>
-              </w:rPr>
-              <w:t>Words</w:t>
+              <w:t>Vocabulary &amp; Doctrine</w:t>
             </w:r>
           </w:p>
         </w:tc>
@@ -6673,15 +6384,8 @@
             <w:tcW w:type="dxa" w:w="2160"/>
           </w:tcPr>
           <w:p>
-            <w:r/>
             <w:r>
-              <w:rPr>
-                <w:rFonts w:ascii="Calibri" w:hAnsi="Calibri"/>
-                <w:b w:val="0"/>
-                <w:i w:val="0"/>
-                <w:sz w:val="20"/>
-              </w:rPr>
-              <w:t>All present</w:t>
+              <w:t>Spoken vocabulary &amp; doctrine</w:t>
             </w:r>
           </w:p>
         </w:tc>
@@ -6690,15 +6394,8 @@
             <w:tcW w:type="dxa" w:w="2160"/>
           </w:tcPr>
           <w:p>
-            <w:r/>
             <w:r>
-              <w:rPr>
-                <w:rFonts w:ascii="Calibri" w:hAnsi="Calibri"/>
-                <w:b w:val="0"/>
-                <w:i w:val="0"/>
-                <w:sz w:val="20"/>
-              </w:rPr>
-              <w:t>All present</w:t>
+              <w:t>100% preserved authentic terms &amp; concepts</w:t>
             </w:r>
           </w:p>
         </w:tc>
@@ -6707,15 +6404,8 @@
             <w:tcW w:type="dxa" w:w="2160"/>
           </w:tcPr>
           <w:p>
-            <w:r/>
             <w:r>
-              <w:rPr>
-                <w:rFonts w:ascii="Calibri" w:hAnsi="Calibri"/>
-                <w:b/>
-                <w:i w:val="0"/>
-                <w:sz w:val="20"/>
-              </w:rPr>
-              <w:t>No change</w:t>
+              <w:t>Substantive Preservation</w:t>
             </w:r>
           </w:p>
         </w:tc>
@@ -6726,15 +6416,8 @@
             <w:tcW w:type="dxa" w:w="2160"/>
           </w:tcPr>
           <w:p>
-            <w:r/>
             <w:r>
-              <w:rPr>
-                <w:rFonts w:ascii="Calibri" w:hAnsi="Calibri"/>
-                <w:b w:val="0"/>
-                <w:i w:val="0"/>
-                <w:sz w:val="20"/>
-              </w:rPr>
-              <w:t>Scripture</w:t>
+              <w:t>Sentence Structure</w:t>
             </w:r>
           </w:p>
         </w:tc>
@@ -6743,15 +6426,8 @@
             <w:tcW w:type="dxa" w:w="2160"/>
           </w:tcPr>
           <w:p>
-            <w:r/>
             <w:r>
-              <w:rPr>
-                <w:rFonts w:ascii="Calibri" w:hAnsi="Calibri"/>
-                <w:b w:val="0"/>
-                <w:i w:val="0"/>
-                <w:sz w:val="20"/>
-              </w:rPr>
-              <w:t>Mixed inline</w:t>
+              <w:t>Oral run-ons, false starts, disjointed syntax</w:t>
             </w:r>
           </w:p>
         </w:tc>
@@ -6760,15 +6436,8 @@
             <w:tcW w:type="dxa" w:w="2160"/>
           </w:tcPr>
           <w:p>
-            <w:r/>
             <w:r>
-              <w:rPr>
-                <w:rFonts w:ascii="Calibri" w:hAnsi="Calibri"/>
-                <w:b w:val="0"/>
-                <w:i w:val="0"/>
-                <w:sz w:val="20"/>
-              </w:rPr>
-              <w:t>Block-quoted with bold reference</w:t>
+              <w:t>Smooth, readable, coherent written prose</w:t>
             </w:r>
           </w:p>
         </w:tc>
@@ -6777,14 +6446,133 @@
             <w:tcW w:type="dxa" w:w="2160"/>
           </w:tcPr>
           <w:p>
-            <w:r/>
             <w:r>
-              <w:rPr>
-                <w:rFonts w:ascii="Calibri" w:hAnsi="Calibri"/>
-                <w:b/>
-                <w:i w:val="0"/>
-                <w:sz w:val="20"/>
-              </w:rPr>
+              <w:t>Syntactical Smoothing</w:t>
+            </w:r>
+          </w:p>
+        </w:tc>
+      </w:tr>
+      <w:tr>
+        <w:tc>
+          <w:tcPr>
+            <w:tcW w:type="dxa" w:w="2160"/>
+          </w:tcPr>
+          <w:p>
+            <w:r>
+              <w:t>Pronouns</w:t>
+            </w:r>
+          </w:p>
+        </w:tc>
+        <w:tc>
+          <w:tcPr>
+            <w:tcW w:type="dxa" w:w="2160"/>
+          </w:tcPr>
+          <w:p>
+            <w:r>
+              <w:t>Shifting conversational pronouns (we, you, I)</w:t>
+            </w:r>
+          </w:p>
+        </w:tc>
+        <w:tc>
+          <w:tcPr>
+            <w:tcW w:type="dxa" w:w="2160"/>
+          </w:tcPr>
+          <w:p>
+            <w:r>
+              <w:t>Harmonized into consistent third-person references</w:t>
+            </w:r>
+          </w:p>
+        </w:tc>
+        <w:tc>
+          <w:tcPr>
+            <w:tcW w:type="dxa" w:w="2160"/>
+          </w:tcPr>
+          <w:p>
+            <w:r>
+              <w:t>Pronoun Harmonization</w:t>
+            </w:r>
+          </w:p>
+        </w:tc>
+      </w:tr>
+      <w:tr>
+        <w:tc>
+          <w:tcPr>
+            <w:tcW w:type="dxa" w:w="2160"/>
+          </w:tcPr>
+          <w:p>
+            <w:r>
+              <w:t>Subheadings (##)</w:t>
+            </w:r>
+          </w:p>
+        </w:tc>
+        <w:tc>
+          <w:tcPr>
+            <w:tcW w:type="dxa" w:w="2160"/>
+          </w:tcPr>
+          <w:p>
+            <w:r>
+              <w:t>None</w:t>
+            </w:r>
+          </w:p>
+        </w:tc>
+        <w:tc>
+          <w:tcPr>
+            <w:tcW w:type="dxa" w:w="2160"/>
+          </w:tcPr>
+          <w:p>
+            <w:r>
+              <w:t>Descriptive headings sticking strictly to speaker's grammar</w:t>
+            </w:r>
+          </w:p>
+        </w:tc>
+        <w:tc>
+          <w:tcPr>
+            <w:tcW w:type="dxa" w:w="2160"/>
+          </w:tcPr>
+          <w:p>
+            <w:r>
+              <w:t>Structural / Speaker-Grounded</w:t>
+            </w:r>
+          </w:p>
+        </w:tc>
+      </w:tr>
+      <w:tr>
+        <w:tc>
+          <w:tcPr>
+            <w:tcW w:type="dxa" w:w="2160"/>
+          </w:tcPr>
+          <w:p>
+            <w:r>
+              <w:t>Scriptures</w:t>
+            </w:r>
+          </w:p>
+        </w:tc>
+        <w:tc>
+          <w:tcPr>
+            <w:tcW w:type="dxa" w:w="2160"/>
+          </w:tcPr>
+          <w:p>
+            <w:r>
+              <w:t>Mixed inline within raw text</w:t>
+            </w:r>
+          </w:p>
+        </w:tc>
+        <w:tc>
+          <w:tcPr>
+            <w:tcW w:type="dxa" w:w="2160"/>
+          </w:tcPr>
+          <w:p>
+            <w:r>
+              <w:t>Block-quoted (&gt;) with bold reference (**Book Chapter:Verse**)</w:t>
+            </w:r>
+          </w:p>
+        </w:tc>
+        <w:tc>
+          <w:tcPr>
+            <w:tcW w:type="dxa" w:w="2160"/>
+          </w:tcPr>
+          <w:p>
+            <w:r>
               <w:t>Structural</w:t>
             </w:r>
           </w:p>
@@ -6796,15 +6584,8 @@
             <w:tcW w:type="dxa" w:w="2160"/>
           </w:tcPr>
           <w:p>
-            <w:r/>
             <w:r>
-              <w:rPr>
-                <w:rFonts w:ascii="Calibri" w:hAnsi="Calibri"/>
-                <w:b w:val="0"/>
-                <w:i w:val="0"/>
-                <w:sz w:val="20"/>
-              </w:rPr>
-              <w:t>Topic marker</w:t>
+              <w:t>Anecdotes &amp; Remarks</w:t>
             </w:r>
           </w:p>
         </w:tc>
@@ -6813,15 +6594,8 @@
             <w:tcW w:type="dxa" w:w="2160"/>
           </w:tcPr>
           <w:p>
-            <w:r/>
             <w:r>
-              <w:rPr>
-                <w:rFonts w:ascii="Calibri" w:hAnsi="Calibri"/>
-                <w:b w:val="0"/>
-                <w:i w:val="0"/>
-                <w:sz w:val="20"/>
-              </w:rPr>
-              <w:t>None</w:t>
+              <w:t>Mixed inline within raw text</w:t>
             </w:r>
           </w:p>
         </w:tc>
@@ -6830,16 +6604,8 @@
             <w:tcW w:type="dxa" w:w="2160"/>
           </w:tcPr>
           <w:p>
-            <w:r/>
             <w:r>
-              <w:rPr>
-                <w:rFonts w:ascii="Consolas" w:hAnsi="Consolas"/>
-                <w:b w:val="0"/>
-                <w:i w:val="0"/>
-                <w:color w:val="333333"/>
-                <w:sz w:val="18"/>
-              </w:rPr>
-              <w:t>## Textual Reasoning and the Pattern of Preaching</w:t>
+              <w:t>Personal stories and side remarks wrapped in *italics*</w:t>
             </w:r>
           </w:p>
         </w:tc>
@@ -6848,235 +6614,8 @@
             <w:tcW w:type="dxa" w:w="2160"/>
           </w:tcPr>
           <w:p>
-            <w:r/>
             <w:r>
-              <w:rPr>
-                <w:rFonts w:ascii="Calibri" w:hAnsi="Calibri"/>
-                <w:b/>
-                <w:i w:val="0"/>
-                <w:sz w:val="20"/>
-              </w:rPr>
-              <w:t>Structural</w:t>
-            </w:r>
-          </w:p>
-        </w:tc>
-      </w:tr>
-      <w:tr>
-        <w:tc>
-          <w:tcPr>
-            <w:tcW w:type="dxa" w:w="2160"/>
-          </w:tcPr>
-          <w:p>
-            <w:r/>
-            <w:r>
-              <w:rPr>
-                <w:rFonts w:ascii="Calibri" w:hAnsi="Calibri"/>
-                <w:b w:val="0"/>
-                <w:i w:val="0"/>
-                <w:sz w:val="20"/>
-              </w:rPr>
-              <w:t>Track title</w:t>
-            </w:r>
-          </w:p>
-        </w:tc>
-        <w:tc>
-          <w:tcPr>
-            <w:tcW w:type="dxa" w:w="2160"/>
-          </w:tcPr>
-          <w:p>
-            <w:r/>
-            <w:r>
-              <w:rPr>
-                <w:rFonts w:ascii="Calibri" w:hAnsi="Calibri"/>
-                <w:b w:val="0"/>
-                <w:i w:val="0"/>
-                <w:sz w:val="20"/>
-              </w:rPr>
-              <w:t>None</w:t>
-            </w:r>
-          </w:p>
-        </w:tc>
-        <w:tc>
-          <w:tcPr>
-            <w:tcW w:type="dxa" w:w="2160"/>
-          </w:tcPr>
-          <w:p>
-            <w:r/>
-            <w:r>
-              <w:rPr>
-                <w:rFonts w:ascii="Consolas" w:hAnsi="Consolas"/>
-                <w:b w:val="0"/>
-                <w:i w:val="0"/>
-                <w:color w:val="333333"/>
-                <w:sz w:val="18"/>
-              </w:rPr>
-              <w:t># Two Kinds of Righteousness — Series 3, Part 5: Track 4</w:t>
-            </w:r>
-          </w:p>
-        </w:tc>
-        <w:tc>
-          <w:tcPr>
-            <w:tcW w:type="dxa" w:w="2160"/>
-          </w:tcPr>
-          <w:p>
-            <w:r/>
-            <w:r>
-              <w:rPr>
-                <w:rFonts w:ascii="Calibri" w:hAnsi="Calibri"/>
-                <w:b/>
-                <w:i w:val="0"/>
-                <w:sz w:val="20"/>
-              </w:rPr>
-              <w:t>Structural</w:t>
-            </w:r>
-          </w:p>
-        </w:tc>
-      </w:tr>
-      <w:tr>
-        <w:tc>
-          <w:tcPr>
-            <w:tcW w:type="dxa" w:w="2160"/>
-          </w:tcPr>
-          <w:p>
-            <w:r/>
-            <w:r>
-              <w:rPr>
-                <w:rFonts w:ascii="Calibri" w:hAnsi="Calibri"/>
-                <w:b w:val="0"/>
-                <w:i w:val="0"/>
-                <w:sz w:val="20"/>
-              </w:rPr>
-              <w:t>"2Nd Timothy"</w:t>
-            </w:r>
-          </w:p>
-        </w:tc>
-        <w:tc>
-          <w:tcPr>
-            <w:tcW w:type="dxa" w:w="2160"/>
-          </w:tcPr>
-          <w:p>
-            <w:r/>
-            <w:r>
-              <w:rPr>
-                <w:rFonts w:ascii="Calibri" w:hAnsi="Calibri"/>
-                <w:b w:val="0"/>
-                <w:i w:val="0"/>
-                <w:sz w:val="20"/>
-              </w:rPr>
-              <w:t>As transcribed</w:t>
-            </w:r>
-          </w:p>
-        </w:tc>
-        <w:tc>
-          <w:tcPr>
-            <w:tcW w:type="dxa" w:w="2160"/>
-          </w:tcPr>
-          <w:p>
-            <w:r/>
-            <w:r>
-              <w:rPr>
-                <w:rFonts w:ascii="Calibri" w:hAnsi="Calibri"/>
-                <w:b w:val="0"/>
-                <w:i w:val="0"/>
-                <w:sz w:val="20"/>
-              </w:rPr>
-              <w:t>As transcribed</w:t>
-            </w:r>
-          </w:p>
-        </w:tc>
-        <w:tc>
-          <w:tcPr>
-            <w:tcW w:type="dxa" w:w="2160"/>
-          </w:tcPr>
-          <w:p>
-            <w:r/>
-            <w:r>
-              <w:rPr>
-                <w:rFonts w:ascii="Calibri" w:hAnsi="Calibri"/>
-                <w:b/>
-                <w:i w:val="0"/>
-                <w:sz w:val="20"/>
-              </w:rPr>
-              <w:t>No change</w:t>
-            </w:r>
-            <w:r>
-              <w:rPr>
-                <w:rFonts w:ascii="Calibri" w:hAnsi="Calibri"/>
-                <w:b w:val="0"/>
-                <w:i w:val="0"/>
-                <w:sz w:val="20"/>
-              </w:rPr>
-              <w:t xml:space="preserve"> (even though it's unconventional)</w:t>
-            </w:r>
-          </w:p>
-        </w:tc>
-      </w:tr>
-      <w:tr>
-        <w:tc>
-          <w:tcPr>
-            <w:tcW w:type="dxa" w:w="2160"/>
-          </w:tcPr>
-          <w:p>
-            <w:r/>
-            <w:r>
-              <w:rPr>
-                <w:rFonts w:ascii="Calibri" w:hAnsi="Calibri"/>
-                <w:b w:val="0"/>
-                <w:i w:val="0"/>
-                <w:sz w:val="20"/>
-              </w:rPr>
-              <w:t>Paragraph breaks</w:t>
-            </w:r>
-          </w:p>
-        </w:tc>
-        <w:tc>
-          <w:tcPr>
-            <w:tcW w:type="dxa" w:w="2160"/>
-          </w:tcPr>
-          <w:p>
-            <w:r/>
-            <w:r>
-              <w:rPr>
-                <w:rFonts w:ascii="Calibri" w:hAnsi="Calibri"/>
-                <w:b w:val="0"/>
-                <w:i w:val="0"/>
-                <w:sz w:val="20"/>
-              </w:rPr>
-              <w:t>Single wall of text</w:t>
-            </w:r>
-          </w:p>
-        </w:tc>
-        <w:tc>
-          <w:tcPr>
-            <w:tcW w:type="dxa" w:w="2160"/>
-          </w:tcPr>
-          <w:p>
-            <w:r/>
-            <w:r>
-              <w:rPr>
-                <w:rFonts w:ascii="Calibri" w:hAnsi="Calibri"/>
-                <w:b w:val="0"/>
-                <w:i w:val="0"/>
-                <w:sz w:val="20"/>
-              </w:rPr>
-              <w:t>Separated into logical paragraphs</w:t>
-            </w:r>
-          </w:p>
-        </w:tc>
-        <w:tc>
-          <w:tcPr>
-            <w:tcW w:type="dxa" w:w="2160"/>
-          </w:tcPr>
-          <w:p>
-            <w:r/>
-            <w:r>
-              <w:rPr>
-                <w:rFonts w:ascii="Calibri" w:hAnsi="Calibri"/>
-                <w:b/>
-                <w:i w:val="0"/>
-                <w:sz w:val="20"/>
-              </w:rPr>
-              <w:t>Structural</w:t>
+              <w:t>Stylistic Distinction</w:t>
             </w:r>
           </w:p>
         </w:tc>
@@ -7969,7 +7508,7 @@
         <w:pStyle w:val="Heading3"/>
       </w:pPr>
       <w:r>
-        <w:t>Phase 4 — Verification</w:t>
+        <w:t>Phase 4 — Verification of Integrity &amp; Flow</w:t>
       </w:r>
     </w:p>
     <w:p>
@@ -7977,20 +7516,7 @@
         <w:pStyle w:val="ListBullet"/>
       </w:pPr>
       <w:r>
-        <w:rPr>
-          <w:rFonts w:ascii="Calibri" w:hAnsi="Calibri"/>
-          <w:b/>
-          <w:i w:val="0"/>
-        </w:rPr>
-        <w:t xml:space="preserve">☐ </w:t>
-      </w:r>
-      <w:r>
-        <w:rPr>
-          <w:rFonts w:ascii="Calibri" w:hAnsi="Calibri"/>
-          <w:b w:val="0"/>
-          <w:i w:val="0"/>
-        </w:rPr>
-        <w:t>Run word-count comparison on a sample of formatted chunks</w:t>
+        <w:t>☐ Confirm speaker's vocabulary, arguments, and theological terms are 100% preserved</w:t>
       </w:r>
     </w:p>
     <w:p>
@@ -7998,20 +7524,7 @@
         <w:pStyle w:val="ListBullet"/>
       </w:pPr>
       <w:r>
-        <w:rPr>
-          <w:rFonts w:ascii="Calibri" w:hAnsi="Calibri"/>
-          <w:b/>
-          <w:i w:val="0"/>
-        </w:rPr>
-        <w:t xml:space="preserve">☐ </w:t>
-      </w:r>
-      <w:r>
-        <w:rPr>
-          <w:rFonts w:ascii="Calibri" w:hAnsi="Calibri"/>
-          <w:b w:val="0"/>
-          <w:i w:val="0"/>
-        </w:rPr>
-        <w:t>Confirm 100% verbatim match</w:t>
+        <w:t>☐ Verify spoken run-ons and sentence fragments are smoothed into readable prose</w:t>
       </w:r>
     </w:p>
     <w:p>
@@ -8019,20 +7532,7 @@
         <w:pStyle w:val="ListBullet"/>
       </w:pPr>
       <w:r>
-        <w:rPr>
-          <w:rFonts w:ascii="Calibri" w:hAnsi="Calibri"/>
-          <w:b/>
-          <w:i w:val="0"/>
-        </w:rPr>
-        <w:t xml:space="preserve">☐ </w:t>
-      </w:r>
-      <w:r>
-        <w:rPr>
-          <w:rFonts w:ascii="Calibri" w:hAnsi="Calibri"/>
-          <w:b w:val="0"/>
-          <w:i w:val="0"/>
-        </w:rPr>
-        <w:t>Spot-check 3–5 chunks for correct italicization and blockquoting</w:t>
+        <w:t>☐ Confirm conversational pronouns are harmonized into consistent third-person references</w:t>
       </w:r>
     </w:p>
     <w:p>

</xml_diff>